<commit_message>
docs(logbook): align log book entries with Review 1 and Review 2 Gantt chart milestones
</commit_message>
<xml_diff>
--- a/Documentation/black-book/log-book/CAPSTONE_PROJECT_LOG_BOOK.docx
+++ b/Documentation/black-book/log-book/CAPSTONE_PROJECT_LOG_BOOK.docx
@@ -1732,7 +1732,7 @@
                 <w:b w:val="0"/>
                 <w:sz w:val="21"/>
               </w:rPr>
-              <w:t>Formed the project group and met faculty mentor Dr. Srikanth Pulipeti to finalize the capstone domain. Identified the operational challenges of daily food wastage and stockouts in artisan bakeries. Formulated the project problem statement, primary research objectives, and created the LaTeX review paper template.</w:t>
+              <w:t>Formed the project group under faculty mentor Dr. Srikanth Pulipeti. Initiated Literature Review &amp; Requirement Finalization. Investigated operational challenges of daily food wastage and stockouts in artisan bakeries. Defined project aim, primary research questions, and structured the LaTeX review paper template.</w:t>
             </w:r>
           </w:p>
         </w:tc>
@@ -1896,7 +1896,7 @@
                 <w:b w:val="0"/>
                 <w:sz w:val="21"/>
               </w:rPr>
-              <w:t>Conducted extensive literature survey covering 25+ peer-reviewed papers on statistical time series (ARIMA, SARIMA, Prophet), machine learning (LightGBM, XGBoost), and stochastic inventory theory (Newsvendor). Identified research gaps in SME inventory systems and authored the Interim Development Plan (IDP).</w:t>
+              <w:t>Conducted extensive literature survey covering 25+ papers on statistical time series (ARIMA, SARIMA, Prophet) and stochastic inventory theory (Newsvendor). Commenced Dataset Collection &amp; Verification: sourced candidate POS transaction logs. Prepared the Interim Development Plan (IDP).</w:t>
             </w:r>
           </w:p>
         </w:tc>
@@ -2060,7 +2060,7 @@
                 <w:b w:val="0"/>
                 <w:sz w:val="21"/>
               </w:rPr>
-              <w:t>Acquired and ingested historical retail sales datasets, including French artisan bakery POS transactions (2021–2022) and Rossmann retail data. Conducted exploratory data analysis, audited store closure days (Mondays and Wednesdays), and established the initial Prophet baseline forecasting pipeline.</w:t>
+              <w:t>Acquired and ingested French artisan bakery POS dataset (2021–2022). Audited data quality, cleaned transaction logs, and mapped store closure days (Mondays and Wednesdays). Analyzed day-of-week sales variation and synthesized domain findings for requirements.</w:t>
             </w:r>
           </w:p>
         </w:tc>
@@ -2224,7 +2224,7 @@
                 <w:b w:val="0"/>
                 <w:sz w:val="21"/>
               </w:rPr>
-              <w:t>Conducted requirements engineering: defined functional and non-functional requirements. Initialized Flutter cross-platform mobile repository. Scaffolded mobile views and conceptualized the operational store briefing layer powered by large language models for non-technical bakery managers.</w:t>
+              <w:t>Completed Literature Review &amp; Requirement Finalization (100% completed). Finalized functional (FR1–FR7) and non-functional requirements. Prepared Review-I presentation deck. Presented Review-I to the faculty panel (Milestone: Review 1 Cleared at Week 4).</w:t>
             </w:r>
           </w:p>
         </w:tc>
@@ -2388,7 +2388,7 @@
                 <w:b w:val="0"/>
                 <w:sz w:val="21"/>
               </w:rPr>
-              <w:t>Formulated the perishable stock waste mitigation strategy: established tier-based discounting (HIGH 20%, MEDIUM 10%) and bundling rules for items nearing shelf-life expiry. Designed the decoupled system architecture separating batch forecasting jobs from interactive REST APIs.</w:t>
+              <w:t>Completed Dataset Collection &amp; Verification (100% completed). Commenced Flutter App Development Setup: configured Flutter cross-platform repository, Material 3 design tokens, theme palette, and screen navigation architecture for store managers.</w:t>
             </w:r>
           </w:p>
         </w:tc>
@@ -2552,7 +2552,7 @@
                 <w:b w:val="0"/>
                 <w:sz w:val="21"/>
               </w:rPr>
-              <w:t>Implemented baseline forecasting models: 7-day rolling moving average, 4-week same-weekday average, and calendar-aligned seasonal naive. Evaluated baseline error benchmarks (WAPE 30.39%) across cross-validation splits to establish formal performance lower bounds.</w:t>
+              <w:t>Flutter App Development: built core mobile screens (dashboard overview, inventory cards, item list). Implemented baseline forecasting models (7-day rolling average, 4-week same-weekday average, seasonal naive) establishing benchmark lower bounds (WAPE 30.39%).</w:t>
             </w:r>
           </w:p>
         </w:tc>
@@ -2716,7 +2716,7 @@
                 <w:b w:val="0"/>
                 <w:sz w:val="21"/>
               </w:rPr>
-              <w:t>Integrated Google Gemini LLM API (gemini-3-flash-preview) for automated executive store briefings. Developed zero-math prompt engineering framework with strict temperature constraints and fallback templates to guarantee deterministic numeric grounding.</w:t>
+              <w:t>Flutter App Development: built item detail view and manual stock check-in screens. Commenced Model Training (Prophet + XGBoost): implemented baseline Facebook Prophet model capturing weekly and yearly additive seasonality. Explored Google Gemini LLM for operational briefings.</w:t>
             </w:r>
           </w:p>
         </w:tc>
@@ -2880,7 +2880,7 @@
                 <w:b w:val="0"/>
                 <w:sz w:val="21"/>
               </w:rPr>
-              <w:t>Maintained repository hygiene, updated technical documentation, and audited data pipeline integrity. Prepared the academic Review-II presentation deck detailing system architecture, data models, and preliminary forecasting benchmarks.</w:t>
+              <w:t>Advanced Flutter App Development to ~90% (waste alert UI, settings view). Explored GBDT regressors on Prophet residuals; observed extreme sparsity on low-volume individual SKU series. Prepared Review-II slide deck (G1-PPT-Review-II.pptx) with re-baselined Gantt chart.</w:t>
             </w:r>
           </w:p>
         </w:tc>
@@ -3044,7 +3044,7 @@
                 <w:b w:val="0"/>
                 <w:sz w:val="21"/>
               </w:rPr>
-              <w:t>Presented academic Review-II to the departmental faculty review panel. Demonstrated core forecasting methodology, system workflow, and baseline results. Received panel approval to proceed with cloud database integration and production backend development.</w:t>
+              <w:t>Presented academic Review-II to the departmental faculty review panel: demonstrated Flutter mobile application (95% complete) and initial forecasting baseline (30% model training progress). Received panel approval to proceed with backend API and cloud database integration.</w:t>
             </w:r>
           </w:p>
         </w:tc>
@@ -3208,7 +3208,7 @@
                 <w:b w:val="0"/>
                 <w:sz w:val="21"/>
               </w:rPr>
-              <w:t>Developed two-stage hybrid forecasting architecture: Prophet capturing macro-seasonality and holiday effects, feeding residuals to a pooled gradient-boosted decision tree (LightGBM). Evaluated SKU-level sparsity and transitioned from individual models to pooled cross-item learning.</w:t>
+              <w:t>Completed Model Training (remaining 70%): overcame SKU sparsity by transitioning from individual tree models to a pooled gradient-boosted decision tree (LightGBM) trained across all items with lag and calendar features. Implemented adaptive fallback for sparse items.</w:t>
             </w:r>
           </w:p>
         </w:tc>
@@ -3372,7 +3372,7 @@
                 <w:b w:val="0"/>
                 <w:sz w:val="21"/>
               </w:rPr>
-              <w:t>Locked the production hybrid architecture. Re-engineered Flutter UI with Material 3 design tokens, responsive cards, and dynamic state management (dashboard, item detail, waste alerts, check-in, and AI briefing). Integrated teammate pull requests.</w:t>
+              <w:t>Locked the production hybrid ML architecture. Completed remaining 5% of Flutter App Development (100% complete): finalized dynamic state management, real-time forecast binding, and waste alert cards. Integrated teammate pull requests and froze frontend interfaces.</w:t>
             </w:r>
           </w:p>
         </w:tc>
@@ -3536,7 +3536,7 @@
                 <w:b w:val="0"/>
                 <w:sz w:val="21"/>
               </w:rPr>
-              <w:t>Provisioned and configured MongoDB Atlas cloud database cluster (restockiq). Designed collections for users, items, and batch forecasts. Performed repository security audit, sanitized exposed credentials, and hardened .gitignore against accidental credential leaks.</w:t>
+              <w:t>Provisioned and configured MongoDB Atlas cloud database cluster (restockiq). Designed collections for users, items, and batch forecasts. Conducted repository security audit, sanitized exposed credentials, and hardened .gitignore against secret leaks.</w:t>
             </w:r>
           </w:p>
         </w:tc>
@@ -3700,7 +3700,7 @@
                 <w:b w:val="0"/>
                 <w:sz w:val="21"/>
               </w:rPr>
-              <w:t>Implemented full FastAPI backend service (main.py): JWT token authentication, item catalog CRUD, batch forecast ingestion, and waste alert endpoints. Built and executed end-to-end integration test suite (verify_e2e.py) validating app-to-cloud communication.</w:t>
+              <w:t>Implemented Backend API, Restock Logic &amp; LLM Narrator: built FastAPI REST service with JWT auth, waste mitigation discount tiers (HIGH 20%, MEDIUM 10%), and Google Gemini API (gemini-3-flash-preview) with zero-math prompt grounding. Completed System Integration (verify_e2e.py).</w:t>
             </w:r>
           </w:p>
         </w:tc>
@@ -3864,7 +3864,7 @@
                 <w:b w:val="0"/>
                 <w:sz w:val="21"/>
               </w:rPr>
-              <w:t>Containerized FastAPI backend using Docker and deployed to Render cloud hosting. Configured GitHub Actions CI/CD workflows, automated keepalive health pings, and nightly batch forecasting scheduler. Implemented reverse-proxy rate limiting.</w:t>
+              <w:t>Containerized FastAPI backend using Docker and deployed live to Render cloud hosting. Configured GitHub Actions CI/CD workflows, automated keepalive health pings, nightly batch forecasting scheduler, and reverse-proxy rate limiting.</w:t>
             </w:r>
           </w:p>
         </w:tc>
@@ -4028,7 +4028,7 @@
                 <w:b w:val="0"/>
                 <w:sz w:val="21"/>
               </w:rPr>
-              <w:t>Executed rigorous empirical validation: 38-fold weekly backtesting (Model A 26.06% pooled WAPE, Canonical Hybrid 22.51% summer folds), 200-iteration circular weather placebo test (weather rejected), and 68,883-unit Newsvendor waste simulation. Passed 55/55 test suite across all 5 tiers. Resolved DEF-001 through DEF-007. Compiled Black Book and finalized submission freeze v1.0-submission.</w:t>
+              <w:t>Testing &amp; Evaluation: executed 38-fold weekly backtesting (Model A 26.06% pooled WAPE, Canonical Hybrid 22.51% summer folds), 200-iteration circular weather placebo test (weather rejected), and 68,883-unit Newsvendor simulation. Passed 55/55 test suite across all 5 tiers. Compiled Black Book and tagged v1.0-submission.</w:t>
             </w:r>
           </w:p>
         </w:tc>

</xml_diff>

<commit_message>
docs(paper): finalize IEEE conference paper v2, update Overleaf package and Black Book assets
</commit_message>
<xml_diff>
--- a/Documentation/black-book/log-book/CAPSTONE_PROJECT_LOG_BOOK.docx
+++ b/Documentation/black-book/log-book/CAPSTONE_PROJECT_LOG_BOOK.docx
@@ -101,8 +101,13 @@
         </w:rPr>
         <w:t xml:space="preserve">Project Title: </w:t>
       </w:r>
+      <w:proofErr w:type="spellStart"/>
       <w:r>
-        <w:t>RestockIQ: Demand Forecasting and Perishable Inventory Optimization for Food Retailers</w:t>
+        <w:t>RestockIQ</w:t>
+      </w:r>
+      <w:proofErr w:type="spellEnd"/>
+      <w:r>
+        <w:t>: Demand Forecasting and Inventory Optimization for Food Retailers</w:t>
       </w:r>
     </w:p>
     <w:p>
@@ -116,8 +121,13 @@
         <w:t xml:space="preserve">Name of Faculty Mentor: </w:t>
       </w:r>
       <w:r>
-        <w:t>Dr. Srikanth Pulipeti</w:t>
+        <w:t xml:space="preserve">Dr. Srikanth </w:t>
       </w:r>
+      <w:proofErr w:type="spellStart"/>
+      <w:r>
+        <w:t>Pulipeti</w:t>
+      </w:r>
+      <w:proofErr w:type="spellEnd"/>
     </w:p>
     <w:p>
       <w:pPr>
@@ -1077,8 +1087,13 @@
         </w:rPr>
         <w:t xml:space="preserve">Project Title: </w:t>
       </w:r>
+      <w:proofErr w:type="spellStart"/>
       <w:r>
-        <w:t>RestockIQ: Demand Forecasting and Perishable Inventory Optimization for Food Retailers</w:t>
+        <w:t>RestockIQ</w:t>
+      </w:r>
+      <w:proofErr w:type="spellEnd"/>
+      <w:r>
+        <w:t>: Demand Forecasting and Perishable Inventory Optimization for Food Retailers</w:t>
       </w:r>
     </w:p>
     <w:tbl>
@@ -1643,7 +1658,21 @@
               <w:rPr>
                 <w:sz w:val="21"/>
               </w:rPr>
-              <w:t>Acquired and ingested French artisan bakery POS dataset (2021–2022). Audited data quality, cleaned transaction logs, and mapped store closure days (Mondays and Wednesdays). Analyzed day-of-week sales variation and synthesized domain findings for requirements.</w:t>
+              <w:t xml:space="preserve">Acquired and ingested French artisan bakery POS dataset (2021–2022). Audited data quality, cleaned transaction logs, and mapped store closure days (Mondays and Wednesdays). </w:t>
+            </w:r>
+            <w:proofErr w:type="spellStart"/>
+            <w:r>
+              <w:rPr>
+                <w:sz w:val="21"/>
+              </w:rPr>
+              <w:t>Analyzed</w:t>
+            </w:r>
+            <w:proofErr w:type="spellEnd"/>
+            <w:r>
+              <w:rPr>
+                <w:sz w:val="21"/>
+              </w:rPr>
+              <w:t xml:space="preserve"> day-of-week sales variation and synthesized domain findings for requirements.</w:t>
             </w:r>
           </w:p>
         </w:tc>
@@ -2195,7 +2224,21 @@
               <w:rPr>
                 <w:sz w:val="21"/>
               </w:rPr>
-              <w:t>Flutter App Development: built item detail view and manual stock check-in screens. Commenced Model Training (Prophet + XGBoost): implemented baseline Facebook Prophet model capturing weekly and yearly additive seasonality. Explored Google Gemini LLM for operational briefings.</w:t>
+              <w:t xml:space="preserve">Flutter App Development: built item detail view and manual stock check-in screens. Commenced Model Training (Prophet + </w:t>
+            </w:r>
+            <w:proofErr w:type="spellStart"/>
+            <w:r>
+              <w:rPr>
+                <w:sz w:val="21"/>
+              </w:rPr>
+              <w:t>XGBoost</w:t>
+            </w:r>
+            <w:proofErr w:type="spellEnd"/>
+            <w:r>
+              <w:rPr>
+                <w:sz w:val="21"/>
+              </w:rPr>
+              <w:t>): implemented baseline Facebook Prophet model capturing weekly and yearly additive seasonality. Explored Google Gemini LLM for operational briefings.</w:t>
             </w:r>
           </w:p>
         </w:tc>
@@ -2474,7 +2517,35 @@
               <w:rPr>
                 <w:sz w:val="21"/>
               </w:rPr>
-              <w:t>Evaluated Prophet baseline forecasts against gradient-boosted decision trees on residuals. Analyzed cross-validation accuracy across summer folds and finalized feature engineering for pooled modeling.</w:t>
+              <w:t xml:space="preserve">Evaluated Prophet baseline forecasts against gradient-boosted decision trees on residuals. </w:t>
+            </w:r>
+            <w:proofErr w:type="spellStart"/>
+            <w:r>
+              <w:rPr>
+                <w:sz w:val="21"/>
+              </w:rPr>
+              <w:t>Analyzed</w:t>
+            </w:r>
+            <w:proofErr w:type="spellEnd"/>
+            <w:r>
+              <w:rPr>
+                <w:sz w:val="21"/>
+              </w:rPr>
+              <w:t xml:space="preserve"> cross-validation accuracy across summer folds and finalized feature engineering for pooled </w:t>
+            </w:r>
+            <w:proofErr w:type="spellStart"/>
+            <w:r>
+              <w:rPr>
+                <w:sz w:val="21"/>
+              </w:rPr>
+              <w:t>modeling</w:t>
+            </w:r>
+            <w:proofErr w:type="spellEnd"/>
+            <w:r>
+              <w:rPr>
+                <w:sz w:val="21"/>
+              </w:rPr>
+              <w:t>.</w:t>
             </w:r>
           </w:p>
         </w:tc>
@@ -2612,7 +2683,21 @@
               <w:rPr>
                 <w:sz w:val="21"/>
               </w:rPr>
-              <w:t>Completed Model Training and overcame SKU sparsity by transitioning from individual tree models to a pooled gradient-boosted decision tree (LightGBM) trained across all items with lag and calendar features. Implemented adaptive fallback for sparse items.</w:t>
+              <w:t>Completed Model Training and overcame SKU sparsity by transitioning from individual tree models to a pooled gradient-boosted decision tree (</w:t>
+            </w:r>
+            <w:proofErr w:type="spellStart"/>
+            <w:r>
+              <w:rPr>
+                <w:sz w:val="21"/>
+              </w:rPr>
+              <w:t>LightGBM</w:t>
+            </w:r>
+            <w:proofErr w:type="spellEnd"/>
+            <w:r>
+              <w:rPr>
+                <w:sz w:val="21"/>
+              </w:rPr>
+              <w:t>) trained across all items with lag and calendar features. Implemented adaptive fallback for sparse items.</w:t>
             </w:r>
           </w:p>
         </w:tc>
@@ -2750,7 +2835,21 @@
               <w:rPr>
                 <w:sz w:val="21"/>
               </w:rPr>
-              <w:t>Locked the production hybrid ML architecture. Completed remaining 5% of Flutter App Development. Finalized dynamic state management, real-time forecast binding, and waste alert cards. Integrated teammate pull requests and froze frontend interfaces.</w:t>
+              <w:t xml:space="preserve">Locked the production hybrid ML architecture. Completed remaining 5% of Flutter App Development. Finalized dynamic state management, real-time forecast binding, and waste alert cards. Integrated teammate </w:t>
+            </w:r>
+            <w:proofErr w:type="gramStart"/>
+            <w:r>
+              <w:rPr>
+                <w:sz w:val="21"/>
+              </w:rPr>
+              <w:t>pull</w:t>
+            </w:r>
+            <w:proofErr w:type="gramEnd"/>
+            <w:r>
+              <w:rPr>
+                <w:sz w:val="21"/>
+              </w:rPr>
+              <w:t xml:space="preserve"> requests and froze frontend interfaces.</w:t>
             </w:r>
           </w:p>
         </w:tc>
@@ -2889,7 +2988,43 @@
               <w:rPr>
                 <w:sz w:val="21"/>
               </w:rPr>
-              <w:t>Provisioned and configured MongoDB Atlas cloud database cluster (restockiq). Designed collections for users, items, and batch forecasts. Conducted repository security audit, sanitized exposed credentials, and hardened .gitignore against secret leaks.</w:t>
+              <w:t>Provisioned and configured MongoDB Atlas cloud database cluster (</w:t>
+            </w:r>
+            <w:proofErr w:type="spellStart"/>
+            <w:r>
+              <w:rPr>
+                <w:sz w:val="21"/>
+              </w:rPr>
+              <w:t>restockiq</w:t>
+            </w:r>
+            <w:proofErr w:type="spellEnd"/>
+            <w:r>
+              <w:rPr>
+                <w:sz w:val="21"/>
+              </w:rPr>
+              <w:t xml:space="preserve">). Designed collections for users, items, and batch forecasts. Conducted repository security audit, sanitized exposed credentials, and </w:t>
+            </w:r>
+            <w:proofErr w:type="gramStart"/>
+            <w:r>
+              <w:rPr>
+                <w:sz w:val="21"/>
+              </w:rPr>
+              <w:t>hardened .</w:t>
+            </w:r>
+            <w:proofErr w:type="spellStart"/>
+            <w:r>
+              <w:rPr>
+                <w:sz w:val="21"/>
+              </w:rPr>
+              <w:t>gitignore</w:t>
+            </w:r>
+            <w:proofErr w:type="spellEnd"/>
+            <w:proofErr w:type="gramEnd"/>
+            <w:r>
+              <w:rPr>
+                <w:sz w:val="21"/>
+              </w:rPr>
+              <w:t xml:space="preserve"> against secret leaks.</w:t>
             </w:r>
           </w:p>
         </w:tc>
@@ -3027,7 +3162,21 @@
               <w:rPr>
                 <w:sz w:val="21"/>
               </w:rPr>
-              <w:t>Implemented Backend API, Restock Logic &amp; LLM Narrator: built FastAPI REST service with JWT auth, waste mitigation discount tiers (HIGH 20%, MEDIUM 10%), and Google Gemini API (gemini-3-flash-preview) with zero-math prompt grounding. Completed System Integration connecting mobile app to live backend.</w:t>
+              <w:t xml:space="preserve">Implemented Backend API, Restock Logic &amp; LLM Narrator: built </w:t>
+            </w:r>
+            <w:proofErr w:type="spellStart"/>
+            <w:r>
+              <w:rPr>
+                <w:sz w:val="21"/>
+              </w:rPr>
+              <w:t>FastAPI</w:t>
+            </w:r>
+            <w:proofErr w:type="spellEnd"/>
+            <w:r>
+              <w:rPr>
+                <w:sz w:val="21"/>
+              </w:rPr>
+              <w:t xml:space="preserve"> REST service with JWT auth, waste mitigation discount tiers (HIGH 20%, MEDIUM 10%), and Google Gemini API (gemini-3-flash-preview) with zero-math prompt grounding. Completed System Integration connecting mobile app to live backend.</w:t>
             </w:r>
           </w:p>
         </w:tc>
@@ -3165,7 +3314,21 @@
               <w:rPr>
                 <w:sz w:val="21"/>
               </w:rPr>
-              <w:t>Containerized FastAPI backend using Docker and deployed live to Render cloud hosting. Configured GitHub Actions CI/CD workflows, automated keepalive health pings, nightly batch forecasting scheduler, and reverse-proxy rate limiting.</w:t>
+              <w:t xml:space="preserve">Containerized </w:t>
+            </w:r>
+            <w:proofErr w:type="spellStart"/>
+            <w:r>
+              <w:rPr>
+                <w:sz w:val="21"/>
+              </w:rPr>
+              <w:t>FastAPI</w:t>
+            </w:r>
+            <w:proofErr w:type="spellEnd"/>
+            <w:r>
+              <w:rPr>
+                <w:sz w:val="21"/>
+              </w:rPr>
+              <w:t xml:space="preserve"> backend using Docker and deployed live to Render cloud hosting. Configured GitHub Actions CI/CD workflows, automated keepalive health pings, nightly batch forecasting scheduler, and reverse-proxy rate limiting.</w:t>
             </w:r>
           </w:p>
         </w:tc>
@@ -3303,7 +3466,21 @@
               <w:rPr>
                 <w:sz w:val="21"/>
               </w:rPr>
-              <w:t>Testing &amp; Evaluation: executed 38-fold weekly backtesting (Model A 26.06% pooled WAPE, Canonical Hybrid 22.51% summer folds), 200-iteration circular weather placebo test (weather rejected), and 68,883-unit Newsvendor simulation. Passed 55/55 test suite across all 5 tiers.</w:t>
+              <w:t xml:space="preserve">Testing &amp; Evaluation: executed 38-fold weekly </w:t>
+            </w:r>
+            <w:proofErr w:type="spellStart"/>
+            <w:r>
+              <w:rPr>
+                <w:sz w:val="21"/>
+              </w:rPr>
+              <w:t>backtesting</w:t>
+            </w:r>
+            <w:proofErr w:type="spellEnd"/>
+            <w:r>
+              <w:rPr>
+                <w:sz w:val="21"/>
+              </w:rPr>
+              <w:t xml:space="preserve"> (Model A 26.06% pooled WAPE, Canonical Hybrid 22.51% summer folds), 200-iteration circular weather placebo test (weather rejected), and 68,883-unit Newsvendor simulation. Passed 55/55 test suite across all 5 tiers.</w:t>
             </w:r>
           </w:p>
         </w:tc>
@@ -3383,6 +3560,8 @@
               <w:right w:w="90" w:type="dxa"/>
             </w:tcMar>
           </w:tcPr>
+          <w:p/>
+          <w:p/>
           <w:p>
             <w:r>
               <w:t>Date: ____________________</w:t>
@@ -3393,8 +3572,13 @@
               <w:spacing w:before="120"/>
             </w:pPr>
             <w:r>
-              <w:t>Place: Shirpur</w:t>
-            </w:r>
+              <w:t xml:space="preserve">Place: </w:t>
+            </w:r>
+            <w:proofErr w:type="spellStart"/>
+            <w:r>
+              <w:t>Shirpur</w:t>
+            </w:r>
+            <w:proofErr w:type="spellEnd"/>
           </w:p>
         </w:tc>
         <w:tc>
@@ -3417,8 +3601,23 @@
             <w:pPr>
               <w:jc w:val="center"/>
             </w:pPr>
-            <w:r>
-              <w:t>______________________________</w:t>
+          </w:p>
+          <w:p>
+            <w:pPr>
+              <w:jc w:val="center"/>
+            </w:pPr>
+          </w:p>
+          <w:p>
+            <w:pPr>
+              <w:jc w:val="center"/>
+            </w:pPr>
+          </w:p>
+          <w:p>
+            <w:pPr>
+              <w:jc w:val="center"/>
+            </w:pPr>
+            <w:r>
+              <w:t>_________________________</w:t>
             </w:r>
           </w:p>
           <w:p>
@@ -3430,8 +3629,16 @@
               <w:rPr>
                 <w:b/>
               </w:rPr>
-              <w:t>Dr. Srikanth Pulipeti</w:t>
-            </w:r>
+              <w:t xml:space="preserve">Dr. Srikanth </w:t>
+            </w:r>
+            <w:proofErr w:type="spellStart"/>
+            <w:r>
+              <w:rPr>
+                <w:b/>
+              </w:rPr>
+              <w:t>Pulipeti</w:t>
+            </w:r>
+            <w:proofErr w:type="spellEnd"/>
           </w:p>
           <w:p>
             <w:pPr>
@@ -3448,8 +3655,13 @@
               <w:jc w:val="center"/>
             </w:pPr>
             <w:r>
-              <w:t>Department of Information Technology, MPSTME, Shirpur</w:t>
-            </w:r>
+              <w:t xml:space="preserve">Department of Information Technology, MPSTME, </w:t>
+            </w:r>
+            <w:proofErr w:type="spellStart"/>
+            <w:r>
+              <w:t>Shirpur</w:t>
+            </w:r>
+            <w:proofErr w:type="spellEnd"/>
           </w:p>
         </w:tc>
       </w:tr>
@@ -3468,12 +3680,8 @@
       </w:pPr>
     </w:p>
     <w:sectPr>
-      <w:headerReference w:type="even" r:id="rId7"/>
-      <w:headerReference w:type="default" r:id="rId8"/>
-      <w:footerReference w:type="even" r:id="rId9"/>
-      <w:footerReference w:type="default" r:id="rId10"/>
-      <w:headerReference w:type="first" r:id="rId11"/>
-      <w:footerReference w:type="first" r:id="rId12"/>
+      <w:headerReference w:type="default" r:id="rId7"/>
+      <w:footerReference w:type="default" r:id="rId8"/>
       <w:pgSz w:w="11906" w:h="16838"/>
       <w:pgMar w:top="1418" w:right="1418" w:bottom="1418" w:left="1418" w:header="708" w:footer="708" w:gutter="0"/>
       <w:pgBorders w:offsetFrom="page">
@@ -3509,16 +3717,6 @@
 </file>
 
 <file path=word/footer1.xml><?xml version="1.0" encoding="utf-8"?>
-<w:ftr xmlns:wpc="http://schemas.microsoft.com/office/word/2010/wordprocessingCanvas" xmlns:cx="http://schemas.microsoft.com/office/drawing/2014/chartex" xmlns:cx1="http://schemas.microsoft.com/office/drawing/2015/9/8/chartex" xmlns:cx2="http://schemas.microsoft.com/office/drawing/2015/10/21/chartex" xmlns:cx3="http://schemas.microsoft.com/office/drawing/2016/5/9/chartex" xmlns:cx4="http://schemas.microsoft.com/office/drawing/2016/5/10/chartex" xmlns:cx5="http://schemas.microsoft.com/office/drawing/2016/5/11/chartex" xmlns:cx6="http://schemas.microsoft.com/office/drawing/2016/5/12/chartex" xmlns:cx7="http://schemas.microsoft.com/office/drawing/2016/5/13/chartex" xmlns:cx8="http://schemas.microsoft.com/office/drawing/2016/5/14/chartex" xmlns:mc="http://schemas.openxmlformats.org/markup-compatibility/2006" xmlns:aink="http://schemas.microsoft.com/office/drawing/2016/ink" xmlns:am3d="http://schemas.microsoft.com/office/drawing/2017/model3d" xmlns:o="urn:schemas-microsoft-com:office:office" xmlns:oel="http://schemas.microsoft.com/office/2019/extlst" xmlns:r="http://schemas.openxmlformats.org/officeDocument/2006/relationships" xmlns:m="http://schemas.openxmlformats.org/officeDocument/2006/math" xmlns:v="urn:schemas-microsoft-com:vml" xmlns:wp14="http://schemas.microsoft.com/office/word/2010/wordprocessingDrawing" xmlns:wp="http://schemas.openxmlformats.org/drawingml/2006/wordprocessingDrawing" xmlns:w10="urn:schemas-microsoft-com:office:word" xmlns:w="http://schemas.openxmlformats.org/wordprocessingml/2006/main" xmlns:w14="http://schemas.microsoft.com/office/word/2010/wordml" xmlns:w15="http://schemas.microsoft.com/office/word/2012/wordml" xmlns:w16cex="http://schemas.microsoft.com/office/word/2018/wordml/cex" xmlns:w16cid="http://schemas.microsoft.com/office/word/2016/wordml/cid" xmlns:w16="http://schemas.microsoft.com/office/word/2018/wordml" xmlns:w16du="http://schemas.microsoft.com/office/word/2023/wordml/word16du" xmlns:w16sdtdh="http://schemas.microsoft.com/office/word/2020/wordml/sdtdatahash" xmlns:w16sdtfl="http://schemas.microsoft.com/office/word/2024/wordml/sdtformatlock" xmlns:w16se="http://schemas.microsoft.com/office/word/2015/wordml/symex" xmlns:wpg="http://schemas.microsoft.com/office/word/2010/wordprocessingGroup" xmlns:wpi="http://schemas.microsoft.com/office/word/2010/wordprocessingInk" xmlns:wne="http://schemas.microsoft.com/office/word/2006/wordml" xmlns:wps="http://schemas.microsoft.com/office/word/2010/wordprocessingShape" mc:Ignorable="w14 w15 w16se w16cid w16 w16cex w16sdtdh w16sdtfl w16du wp14">
-  <w:p>
-    <w:pPr>
-      <w:pStyle w:val="Footer"/>
-    </w:pPr>
-  </w:p>
-</w:ftr>
-</file>
-
-<file path=word/footer2.xml><?xml version="1.0" encoding="utf-8"?>
 <w:ftr xmlns:wpc="http://schemas.microsoft.com/office/word/2010/wordprocessingCanvas" xmlns:cx="http://schemas.microsoft.com/office/drawing/2014/chartex" xmlns:cx1="http://schemas.microsoft.com/office/drawing/2015/9/8/chartex" xmlns:cx2="http://schemas.microsoft.com/office/drawing/2015/10/21/chartex" xmlns:cx3="http://schemas.microsoft.com/office/drawing/2016/5/9/chartex" xmlns:cx4="http://schemas.microsoft.com/office/drawing/2016/5/10/chartex" xmlns:cx5="http://schemas.microsoft.com/office/drawing/2016/5/11/chartex" xmlns:cx6="http://schemas.microsoft.com/office/drawing/2016/5/12/chartex" xmlns:cx7="http://schemas.microsoft.com/office/drawing/2016/5/13/chartex" xmlns:cx8="http://schemas.microsoft.com/office/drawing/2016/5/14/chartex" xmlns:mc="http://schemas.openxmlformats.org/markup-compatibility/2006" xmlns:aink="http://schemas.microsoft.com/office/drawing/2016/ink" xmlns:am3d="http://schemas.microsoft.com/office/drawing/2017/model3d" xmlns:o="urn:schemas-microsoft-com:office:office" xmlns:oel="http://schemas.microsoft.com/office/2019/extlst" xmlns:r="http://schemas.openxmlformats.org/officeDocument/2006/relationships" xmlns:m="http://schemas.openxmlformats.org/officeDocument/2006/math" xmlns:v="urn:schemas-microsoft-com:vml" xmlns:wp14="http://schemas.microsoft.com/office/word/2010/wordprocessingDrawing" xmlns:wp="http://schemas.openxmlformats.org/drawingml/2006/wordprocessingDrawing" xmlns:w10="urn:schemas-microsoft-com:office:word" xmlns:w="http://schemas.openxmlformats.org/wordprocessingml/2006/main" xmlns:w14="http://schemas.microsoft.com/office/word/2010/wordml" xmlns:w15="http://schemas.microsoft.com/office/word/2012/wordml" xmlns:w16cex="http://schemas.microsoft.com/office/word/2018/wordml/cex" xmlns:w16cid="http://schemas.microsoft.com/office/word/2016/wordml/cid" xmlns:w16="http://schemas.microsoft.com/office/word/2018/wordml" xmlns:w16du="http://schemas.microsoft.com/office/word/2023/wordml/word16du" xmlns:w16sdtdh="http://schemas.microsoft.com/office/word/2020/wordml/sdtdatahash" xmlns:w16sdtfl="http://schemas.microsoft.com/office/word/2024/wordml/sdtformatlock" xmlns:w16se="http://schemas.microsoft.com/office/word/2015/wordml/symex" xmlns:wpg="http://schemas.microsoft.com/office/word/2010/wordprocessingGroup" xmlns:wpi="http://schemas.microsoft.com/office/word/2010/wordprocessingInk" xmlns:wne="http://schemas.microsoft.com/office/word/2006/wordml" xmlns:wps="http://schemas.microsoft.com/office/word/2010/wordprocessingShape" mc:Ignorable="w14 w15 w16se w16cid w16 w16cex w16sdtdh w16sdtfl w16du wp14">
   <w:p>
     <w:pPr>
@@ -3574,16 +3772,6 @@
 </w:ftr>
 </file>
 
-<file path=word/footer3.xml><?xml version="1.0" encoding="utf-8"?>
-<w:ftr xmlns:wpc="http://schemas.microsoft.com/office/word/2010/wordprocessingCanvas" xmlns:cx="http://schemas.microsoft.com/office/drawing/2014/chartex" xmlns:cx1="http://schemas.microsoft.com/office/drawing/2015/9/8/chartex" xmlns:cx2="http://schemas.microsoft.com/office/drawing/2015/10/21/chartex" xmlns:cx3="http://schemas.microsoft.com/office/drawing/2016/5/9/chartex" xmlns:cx4="http://schemas.microsoft.com/office/drawing/2016/5/10/chartex" xmlns:cx5="http://schemas.microsoft.com/office/drawing/2016/5/11/chartex" xmlns:cx6="http://schemas.microsoft.com/office/drawing/2016/5/12/chartex" xmlns:cx7="http://schemas.microsoft.com/office/drawing/2016/5/13/chartex" xmlns:cx8="http://schemas.microsoft.com/office/drawing/2016/5/14/chartex" xmlns:mc="http://schemas.openxmlformats.org/markup-compatibility/2006" xmlns:aink="http://schemas.microsoft.com/office/drawing/2016/ink" xmlns:am3d="http://schemas.microsoft.com/office/drawing/2017/model3d" xmlns:o="urn:schemas-microsoft-com:office:office" xmlns:oel="http://schemas.microsoft.com/office/2019/extlst" xmlns:r="http://schemas.openxmlformats.org/officeDocument/2006/relationships" xmlns:m="http://schemas.openxmlformats.org/officeDocument/2006/math" xmlns:v="urn:schemas-microsoft-com:vml" xmlns:wp14="http://schemas.microsoft.com/office/word/2010/wordprocessingDrawing" xmlns:wp="http://schemas.openxmlformats.org/drawingml/2006/wordprocessingDrawing" xmlns:w10="urn:schemas-microsoft-com:office:word" xmlns:w="http://schemas.openxmlformats.org/wordprocessingml/2006/main" xmlns:w14="http://schemas.microsoft.com/office/word/2010/wordml" xmlns:w15="http://schemas.microsoft.com/office/word/2012/wordml" xmlns:w16cex="http://schemas.microsoft.com/office/word/2018/wordml/cex" xmlns:w16cid="http://schemas.microsoft.com/office/word/2016/wordml/cid" xmlns:w16="http://schemas.microsoft.com/office/word/2018/wordml" xmlns:w16du="http://schemas.microsoft.com/office/word/2023/wordml/word16du" xmlns:w16sdtdh="http://schemas.microsoft.com/office/word/2020/wordml/sdtdatahash" xmlns:w16sdtfl="http://schemas.microsoft.com/office/word/2024/wordml/sdtformatlock" xmlns:w16se="http://schemas.microsoft.com/office/word/2015/wordml/symex" xmlns:wpg="http://schemas.microsoft.com/office/word/2010/wordprocessingGroup" xmlns:wpi="http://schemas.microsoft.com/office/word/2010/wordprocessingInk" xmlns:wne="http://schemas.microsoft.com/office/word/2006/wordml" xmlns:wps="http://schemas.microsoft.com/office/word/2010/wordprocessingShape" mc:Ignorable="w14 w15 w16se w16cid w16 w16cex w16sdtdh w16sdtfl w16du wp14">
-  <w:p>
-    <w:pPr>
-      <w:pStyle w:val="Footer"/>
-    </w:pPr>
-  </w:p>
-</w:ftr>
-</file>
-
 <file path=word/footnotes.xml><?xml version="1.0" encoding="utf-8"?>
 <w:footnotes xmlns:wpc="http://schemas.microsoft.com/office/word/2010/wordprocessingCanvas" xmlns:cx="http://schemas.microsoft.com/office/drawing/2014/chartex" xmlns:cx1="http://schemas.microsoft.com/office/drawing/2015/9/8/chartex" xmlns:cx2="http://schemas.microsoft.com/office/drawing/2015/10/21/chartex" xmlns:cx3="http://schemas.microsoft.com/office/drawing/2016/5/9/chartex" xmlns:cx4="http://schemas.microsoft.com/office/drawing/2016/5/10/chartex" xmlns:cx5="http://schemas.microsoft.com/office/drawing/2016/5/11/chartex" xmlns:cx6="http://schemas.microsoft.com/office/drawing/2016/5/12/chartex" xmlns:cx7="http://schemas.microsoft.com/office/drawing/2016/5/13/chartex" xmlns:cx8="http://schemas.microsoft.com/office/drawing/2016/5/14/chartex" xmlns:mc="http://schemas.openxmlformats.org/markup-compatibility/2006" xmlns:aink="http://schemas.microsoft.com/office/drawing/2016/ink" xmlns:am3d="http://schemas.microsoft.com/office/drawing/2017/model3d" xmlns:o="urn:schemas-microsoft-com:office:office" xmlns:oel="http://schemas.microsoft.com/office/2019/extlst" xmlns:r="http://schemas.openxmlformats.org/officeDocument/2006/relationships" xmlns:m="http://schemas.openxmlformats.org/officeDocument/2006/math" xmlns:v="urn:schemas-microsoft-com:vml" xmlns:wp14="http://schemas.microsoft.com/office/word/2010/wordprocessingDrawing" xmlns:wp="http://schemas.openxmlformats.org/drawingml/2006/wordprocessingDrawing" xmlns:w10="urn:schemas-microsoft-com:office:word" xmlns:w="http://schemas.openxmlformats.org/wordprocessingml/2006/main" xmlns:w14="http://schemas.microsoft.com/office/word/2010/wordml" xmlns:w15="http://schemas.microsoft.com/office/word/2012/wordml" xmlns:w16cex="http://schemas.microsoft.com/office/word/2018/wordml/cex" xmlns:w16cid="http://schemas.microsoft.com/office/word/2016/wordml/cid" xmlns:w16="http://schemas.microsoft.com/office/word/2018/wordml" xmlns:w16du="http://schemas.microsoft.com/office/word/2023/wordml/word16du" xmlns:w16sdtdh="http://schemas.microsoft.com/office/word/2020/wordml/sdtdatahash" xmlns:w16sdtfl="http://schemas.microsoft.com/office/word/2024/wordml/sdtformatlock" xmlns:w16se="http://schemas.microsoft.com/office/word/2015/wordml/symex" xmlns:wpg="http://schemas.microsoft.com/office/word/2010/wordprocessingGroup" xmlns:wpi="http://schemas.microsoft.com/office/word/2010/wordprocessingInk" xmlns:wne="http://schemas.microsoft.com/office/word/2006/wordml" xmlns:wps="http://schemas.microsoft.com/office/word/2010/wordprocessingShape" mc:Ignorable="w14 w15 w16se w16cid w16 w16cex w16sdtdh w16sdtfl w16du wp14">
   <w:footnote w:type="separator" w:id="-1">
@@ -3607,16 +3795,6 @@
 <w:hdr xmlns:wpc="http://schemas.microsoft.com/office/word/2010/wordprocessingCanvas" xmlns:cx="http://schemas.microsoft.com/office/drawing/2014/chartex" xmlns:cx1="http://schemas.microsoft.com/office/drawing/2015/9/8/chartex" xmlns:cx2="http://schemas.microsoft.com/office/drawing/2015/10/21/chartex" xmlns:cx3="http://schemas.microsoft.com/office/drawing/2016/5/9/chartex" xmlns:cx4="http://schemas.microsoft.com/office/drawing/2016/5/10/chartex" xmlns:cx5="http://schemas.microsoft.com/office/drawing/2016/5/11/chartex" xmlns:cx6="http://schemas.microsoft.com/office/drawing/2016/5/12/chartex" xmlns:cx7="http://schemas.microsoft.com/office/drawing/2016/5/13/chartex" xmlns:cx8="http://schemas.microsoft.com/office/drawing/2016/5/14/chartex" xmlns:mc="http://schemas.openxmlformats.org/markup-compatibility/2006" xmlns:aink="http://schemas.microsoft.com/office/drawing/2016/ink" xmlns:am3d="http://schemas.microsoft.com/office/drawing/2017/model3d" xmlns:o="urn:schemas-microsoft-com:office:office" xmlns:oel="http://schemas.microsoft.com/office/2019/extlst" xmlns:r="http://schemas.openxmlformats.org/officeDocument/2006/relationships" xmlns:m="http://schemas.openxmlformats.org/officeDocument/2006/math" xmlns:v="urn:schemas-microsoft-com:vml" xmlns:wp14="http://schemas.microsoft.com/office/word/2010/wordprocessingDrawing" xmlns:wp="http://schemas.openxmlformats.org/drawingml/2006/wordprocessingDrawing" xmlns:w10="urn:schemas-microsoft-com:office:word" xmlns:w="http://schemas.openxmlformats.org/wordprocessingml/2006/main" xmlns:w14="http://schemas.microsoft.com/office/word/2010/wordml" xmlns:w15="http://schemas.microsoft.com/office/word/2012/wordml" xmlns:w16cex="http://schemas.microsoft.com/office/word/2018/wordml/cex" xmlns:w16cid="http://schemas.microsoft.com/office/word/2016/wordml/cid" xmlns:w16="http://schemas.microsoft.com/office/word/2018/wordml" xmlns:w16du="http://schemas.microsoft.com/office/word/2023/wordml/word16du" xmlns:w16sdtdh="http://schemas.microsoft.com/office/word/2020/wordml/sdtdatahash" xmlns:w16sdtfl="http://schemas.microsoft.com/office/word/2024/wordml/sdtformatlock" xmlns:w16se="http://schemas.microsoft.com/office/word/2015/wordml/symex" xmlns:wpg="http://schemas.microsoft.com/office/word/2010/wordprocessingGroup" xmlns:wpi="http://schemas.microsoft.com/office/word/2010/wordprocessingInk" xmlns:wne="http://schemas.microsoft.com/office/word/2006/wordml" xmlns:wps="http://schemas.microsoft.com/office/word/2010/wordprocessingShape" mc:Ignorable="w14 w15 w16se w16cid w16 w16cex w16sdtdh w16sdtfl w16du wp14">
   <w:p>
     <w:pPr>
-      <w:pStyle w:val="Header"/>
-    </w:pPr>
-  </w:p>
-</w:hdr>
-</file>
-
-<file path=word/header2.xml><?xml version="1.0" encoding="utf-8"?>
-<w:hdr xmlns:wpc="http://schemas.microsoft.com/office/word/2010/wordprocessingCanvas" xmlns:cx="http://schemas.microsoft.com/office/drawing/2014/chartex" xmlns:cx1="http://schemas.microsoft.com/office/drawing/2015/9/8/chartex" xmlns:cx2="http://schemas.microsoft.com/office/drawing/2015/10/21/chartex" xmlns:cx3="http://schemas.microsoft.com/office/drawing/2016/5/9/chartex" xmlns:cx4="http://schemas.microsoft.com/office/drawing/2016/5/10/chartex" xmlns:cx5="http://schemas.microsoft.com/office/drawing/2016/5/11/chartex" xmlns:cx6="http://schemas.microsoft.com/office/drawing/2016/5/12/chartex" xmlns:cx7="http://schemas.microsoft.com/office/drawing/2016/5/13/chartex" xmlns:cx8="http://schemas.microsoft.com/office/drawing/2016/5/14/chartex" xmlns:mc="http://schemas.openxmlformats.org/markup-compatibility/2006" xmlns:aink="http://schemas.microsoft.com/office/drawing/2016/ink" xmlns:am3d="http://schemas.microsoft.com/office/drawing/2017/model3d" xmlns:o="urn:schemas-microsoft-com:office:office" xmlns:oel="http://schemas.microsoft.com/office/2019/extlst" xmlns:r="http://schemas.openxmlformats.org/officeDocument/2006/relationships" xmlns:m="http://schemas.openxmlformats.org/officeDocument/2006/math" xmlns:v="urn:schemas-microsoft-com:vml" xmlns:wp14="http://schemas.microsoft.com/office/word/2010/wordprocessingDrawing" xmlns:wp="http://schemas.openxmlformats.org/drawingml/2006/wordprocessingDrawing" xmlns:w10="urn:schemas-microsoft-com:office:word" xmlns:w="http://schemas.openxmlformats.org/wordprocessingml/2006/main" xmlns:w14="http://schemas.microsoft.com/office/word/2010/wordml" xmlns:w15="http://schemas.microsoft.com/office/word/2012/wordml" xmlns:w16cex="http://schemas.microsoft.com/office/word/2018/wordml/cex" xmlns:w16cid="http://schemas.microsoft.com/office/word/2016/wordml/cid" xmlns:w16="http://schemas.microsoft.com/office/word/2018/wordml" xmlns:w16du="http://schemas.microsoft.com/office/word/2023/wordml/word16du" xmlns:w16sdtdh="http://schemas.microsoft.com/office/word/2020/wordml/sdtdatahash" xmlns:w16sdtfl="http://schemas.microsoft.com/office/word/2024/wordml/sdtformatlock" xmlns:w16se="http://schemas.microsoft.com/office/word/2015/wordml/symex" xmlns:wpg="http://schemas.microsoft.com/office/word/2010/wordprocessingGroup" xmlns:wpi="http://schemas.microsoft.com/office/word/2010/wordprocessingInk" xmlns:wne="http://schemas.microsoft.com/office/word/2006/wordml" xmlns:wps="http://schemas.microsoft.com/office/word/2010/wordprocessingShape" mc:Ignorable="w14 w15 w16se w16cid w16 w16cex w16sdtdh w16sdtfl w16du wp14">
-  <w:p>
-    <w:pPr>
       <w:pBdr>
         <w:bottom w:val="single" w:sz="6" w:space="2" w:color="000000"/>
       </w:pBdr>
@@ -3627,11 +3805,15 @@
     <w:r>
       <w:rPr>
         <w:b/>
-        <w:sz w:val="20"/>
+        <w:bCs/>
       </w:rPr>
-      <w:t>RESTOCKIQ</w:t>
+      <w:t>Demand Forecasting and Inventory Optimization for Food</w:t>
     </w:r>
     <w:r>
+      <w:rPr>
+        <w:b/>
+        <w:bCs/>
+      </w:rPr>
       <w:tab/>
     </w:r>
     <w:r>
@@ -3641,16 +3823,6 @@
       </w:rPr>
       <w:t>ACADEMIC SESSION 2026–27</w:t>
     </w:r>
-  </w:p>
-</w:hdr>
-</file>
-
-<file path=word/header3.xml><?xml version="1.0" encoding="utf-8"?>
-<w:hdr xmlns:wpc="http://schemas.microsoft.com/office/word/2010/wordprocessingCanvas" xmlns:cx="http://schemas.microsoft.com/office/drawing/2014/chartex" xmlns:cx1="http://schemas.microsoft.com/office/drawing/2015/9/8/chartex" xmlns:cx2="http://schemas.microsoft.com/office/drawing/2015/10/21/chartex" xmlns:cx3="http://schemas.microsoft.com/office/drawing/2016/5/9/chartex" xmlns:cx4="http://schemas.microsoft.com/office/drawing/2016/5/10/chartex" xmlns:cx5="http://schemas.microsoft.com/office/drawing/2016/5/11/chartex" xmlns:cx6="http://schemas.microsoft.com/office/drawing/2016/5/12/chartex" xmlns:cx7="http://schemas.microsoft.com/office/drawing/2016/5/13/chartex" xmlns:cx8="http://schemas.microsoft.com/office/drawing/2016/5/14/chartex" xmlns:mc="http://schemas.openxmlformats.org/markup-compatibility/2006" xmlns:aink="http://schemas.microsoft.com/office/drawing/2016/ink" xmlns:am3d="http://schemas.microsoft.com/office/drawing/2017/model3d" xmlns:o="urn:schemas-microsoft-com:office:office" xmlns:oel="http://schemas.microsoft.com/office/2019/extlst" xmlns:r="http://schemas.openxmlformats.org/officeDocument/2006/relationships" xmlns:m="http://schemas.openxmlformats.org/officeDocument/2006/math" xmlns:v="urn:schemas-microsoft-com:vml" xmlns:wp14="http://schemas.microsoft.com/office/word/2010/wordprocessingDrawing" xmlns:wp="http://schemas.openxmlformats.org/drawingml/2006/wordprocessingDrawing" xmlns:w10="urn:schemas-microsoft-com:office:word" xmlns:w="http://schemas.openxmlformats.org/wordprocessingml/2006/main" xmlns:w14="http://schemas.microsoft.com/office/word/2010/wordml" xmlns:w15="http://schemas.microsoft.com/office/word/2012/wordml" xmlns:w16cex="http://schemas.microsoft.com/office/word/2018/wordml/cex" xmlns:w16cid="http://schemas.microsoft.com/office/word/2016/wordml/cid" xmlns:w16="http://schemas.microsoft.com/office/word/2018/wordml" xmlns:w16du="http://schemas.microsoft.com/office/word/2023/wordml/word16du" xmlns:w16sdtdh="http://schemas.microsoft.com/office/word/2020/wordml/sdtdatahash" xmlns:w16sdtfl="http://schemas.microsoft.com/office/word/2024/wordml/sdtformatlock" xmlns:w16se="http://schemas.microsoft.com/office/word/2015/wordml/symex" xmlns:wpg="http://schemas.microsoft.com/office/word/2010/wordprocessingGroup" xmlns:wpi="http://schemas.microsoft.com/office/word/2010/wordprocessingInk" xmlns:wne="http://schemas.microsoft.com/office/word/2006/wordml" xmlns:wps="http://schemas.microsoft.com/office/word/2010/wordprocessingShape" mc:Ignorable="w14 w15 w16se w16cid w16 w16cex w16sdtdh w16sdtfl w16du wp14">
-  <w:p>
-    <w:pPr>
-      <w:pStyle w:val="Header"/>
-    </w:pPr>
   </w:p>
 </w:hdr>
 </file>
@@ -4306,6 +4478,7 @@
   <w:style w:type="character" w:default="1" w:styleId="DefaultParagraphFont">
     <w:name w:val="Default Paragraph Font"/>
     <w:uiPriority w:val="1"/>
+    <w:semiHidden/>
     <w:unhideWhenUsed/>
   </w:style>
   <w:style w:type="table" w:default="1" w:styleId="TableNormal">

</xml_diff>